<commit_message>
[NovelOS-Overhaul] Tai thiet toan dien Chuong 43-46: Nang cap phong an vi dien tang 6, khac phuc loi hoi quy, hoan tat tron ven Hoi 1 (Arc 1) voi 46 chuong (118,637 tu)
</commit_message>
<xml_diff>
--- a/manuscript/word/volume_01/arc_01/ch_043.docx
+++ b/manuscript/word/volume_01/arc_01/ch_043.docx
@@ -15,7 +15,7 @@
         </w:rPr>
         <w:t>PHÁ TRỜI</w:t>
         <w:br/>
-        <w:t>CHƯƠNG 43: VÙNG NƯỚC ĐỎ VÀ RANH GIỚI ÁP SUẤT</w:t>
+        <w:t>CHƯƠNG 43: THỦY MÔN CỔ PHÁCH VÀ DẤU VẾT VỰC SÂU NGOẠI GIỚI</w:t>
       </w:r>
     </w:p>
     <w:p>
@@ -75,7 +75,7 @@
           <w:color w:val="141414"/>
           <w:sz w:val="24"/>
         </w:rPr>
-        <w:t>title: "Vùng Nước Đỏ Và Ranh Giới Áp Suất"</w:t>
+        <w:t>title: "Thủy Môn Cổ Phách Và Dấu Vết Vực Sâu Ngoại Giới"</w:t>
       </w:r>
     </w:p>
     <w:p>
@@ -135,7 +135,7 @@
           <w:color w:val="141414"/>
           <w:sz w:val="24"/>
         </w:rPr>
-        <w:t>location: "Ngã ba sông Nhà Bè, TP.HCM"</w:t>
+        <w:t>location: "Ngã ba sông Nhà Bè (độ sâu 40m), TP.HCM"</w:t>
       </w:r>
     </w:p>
     <w:p>
@@ -165,7 +165,7 @@
           <w:color w:val="141414"/>
           <w:sz w:val="24"/>
         </w:rPr>
-        <w:t>word_count: 2934</w:t>
+        <w:t>word_count: 2850</w:t>
       </w:r>
     </w:p>
     <w:p>
@@ -210,7 +210,7 @@
           <w:color w:val="141414"/>
           <w:sz w:val="24"/>
         </w:rPr>
-        <w:t>Gió từ cửa biển Cần Giờ thốc ngược vào lòng sông Soài Rạp mang theo vị mằn mặn nồng gắt của đại dương, xộc thẳng vào cánh mũi tôi. Khác hẳn với mùi rêu mốc ẩm ướt quen thuộc của những đoạn sông chảy qua Thanh Đa hay cầu Bình Lợi, không khí tại ngã ba sông Nhà Bè ngập tràn cảm giác khoáng đạt nhưng cũng đầy khắc nghiệt.</w:t>
+        <w:t>Tại tâm điểm ngã ba sông Nhà Bè — nơi dòng nước sông Sài Gòn và sông Đồng Nai cuộn trào hợp lưu trước khi tách thành hai luồng Soài Rạp và Lòng Tàu đổ ra biển Cần Giờ — con tàu khảo sát viễn thám `Đại Dương 09` đã buông bốn mỏ neo trọng tải lớn, ghìm mình vững chãi giữa những đợt sóng đỏ ngầu phù sa.</w:t>
       </w:r>
     </w:p>
     <w:p>
@@ -225,7 +225,7 @@
           <w:color w:val="141414"/>
           <w:sz w:val="24"/>
         </w:rPr>
-        <w:t>Cách mạn tàu `Đại Dương 09` chừng tám trăm mét về phía luồng hàng hải quốc tế, một chiếc tàu container khổng lồ dài hơn hai trăm mét mang cờ Panama đang chậm rãi xẻ sóng tiến về cụm cảng Hiệp Phước. Hồi còi tàu vang lên một tiếng trầm đục, rền rĩ kéo dài như tiếng thở dài của một sinh vật kim khí thời hiện đại, làm rung chuyển cả những vạt dừa nước lúp xúp ven bờ huyện Nhơn Trạch bên kia ranh giới Đồng Nai.</w:t>
+        <w:t>Thế nhưng, bầu không khí bao trùm mặt sông lúc này không hề mang vẻ yên ả của một ngày thu phương Nam.</w:t>
       </w:r>
     </w:p>
     <w:p>
@@ -240,7 +240,7 @@
           <w:color w:val="141414"/>
           <w:sz w:val="24"/>
         </w:rPr>
-        <w:t>Tiếng còi tàu ấy đột ngột kéo phăng toàn bộ sự hưng phấn kỳ ảo của buổi sáng trở lại với mặt đất.</w:t>
+        <w:t>Một màn sương mù xám bạc dày đặc bốc lên cuồn cuộn từ mặt nước, tỏa ra một mùi hương ngai ngái nồng đượm của khoáng thạch cổ xưa và lưu huỳnh đáy biển. Tầm nhìn của hoa tiêu trên đài chỉ huy bị bóp nghẹt xuống dưới năm mươi mét. Ánh nắng gắt gao ban trưa khi rọi qua màn sương quánh đặc ấy bỗng biến thành một thứ ánh sáng lờ nhờ màu chì ma quái.</w:t>
       </w:r>
     </w:p>
     <w:p>
@@ -255,7 +255,7 @@
           <w:color w:val="141414"/>
           <w:sz w:val="24"/>
         </w:rPr>
-        <w:t>Chiếc điện thoại để trong túi áo bảo hộ dã chiến của tôi bỗng rung lên bần bật ba hồi dài. Tôi rút máy ra nhìn màn hình. Hai tin nhắn mới hiện lên cùng lúc: một tin nhắn từ kỹ sư Tuấn — phó phòng phụ trách máy chủ của Viện Nghiên cứu — báo cáo các luồng dữ liệu quan trắc địa chấn ngầm từ trạm Ba Son và Thủ Thiêm đã được đồng bộ đầy đủ lên cụm máy chủ trung tâm; tin còn lại là thông báo tự động từ ngân hàng nhắc nợ tiền điện và tiền rác tháng Mười của căn phòng trọ nhỏ trên đường Ung Văn Khiêm.</w:t>
+        <w:t>Trong phòng điều hành tác chiến của tàu, không khí căng thẳng như một sợi dây đàn sắp đứt.</w:t>
       </w:r>
     </w:p>
     <w:p>
@@ -270,7 +270,7 @@
           <w:color w:val="141414"/>
           <w:sz w:val="24"/>
         </w:rPr>
-        <w:t>Tôi nhìn dòng thông báo trên màn hình điện thoại, khẽ nhếch môi thở ra một làn hơi nhẹ. Giữa lúc chân tôi đang đứng trên con tàu quân sự viễn thám trị giá hàng trăm tỷ đồng, chuẩn bị đối mặt với một cấu trúc ngầm bí ẩn chôn sâu dưới bùn đáy sông, thì cuộc sống đời thường của một thanh niên hai mươi lăm tuổi tại Sài Gòn vẫn không ngừng gõ cửa đòi nợ.</w:t>
+        <w:t>"Báo cáo Viện trưởng Nam, cụm cảm biến lượng tử đo trường biến thiên đáy sâu bắt đầu nhảy loạn xạ!" Kỹ sư Tuấn nhìn chằm chằm vào màn hình máy chủ, mồ hôi rịn ra trên trán: "Độ lệch từ trường khu vực ngã ba sông đã vượt ngưỡng bốn trăm nanoTesla, tăng gấp sáu lần mức bình thường! Nghiêm trọng hơn, mô hình quét sonar 3D đáy sông liên tục báo lỗi ma trận điểm ảnh — dường như có một trường lực vô hình đang bẻ cong cả sóng âm phản xạ!"</w:t>
       </w:r>
     </w:p>
     <w:p>
@@ -285,7 +285,7 @@
           <w:color w:val="141414"/>
           <w:sz w:val="24"/>
         </w:rPr>
-        <w:t>Thế giới này không hề biến thành một cõi tiên bồng bềnh sau một đêm. Cơm áo, công việc, trách nhiệm và áp lực mưu sinh vẫn bám chặt lấy từng thớ thịt, từng nhịp thở của tôi như một sợi dây neo vô hình giữ chặt lấy bờ cõi hiện thực.</w:t>
+        <w:t>Tiến sĩ Trịnh Hoài Nam đứng bên bàn sa bàn số, hai tay chống chặt lên mép bàn, vẻ mặt ngưng trọng tột độ. Ông quay sang chú Phan Thanh Tùng:</w:t>
       </w:r>
     </w:p>
     <w:p>
@@ -300,7 +300,7 @@
           <w:color w:val="141414"/>
           <w:sz w:val="24"/>
         </w:rPr>
-        <w:t>"Cậu An, uống ngụm trà nóng đi."</w:t>
+        <w:t>"Chú Tùng, các bản dập văn tự cổ trên lưng rùa đá Thủy Trấn Thạch ở Thủ Thiêm có ghi nhận hiện tượng bẻ cong sóng âm và từ trường xoắn ốc như thế này không?"</w:t>
       </w:r>
     </w:p>
     <w:p>
@@ -315,7 +315,7 @@
           <w:color w:val="141414"/>
           <w:sz w:val="24"/>
         </w:rPr>
-        <w:t>Tiếng nói trầm ấm của chú Phan Thanh Tùng cắt ngang dòng suy nghĩ của tôi. Chú bước tới bên lan can boong mũi, đưa cho tôi một chiếc ly giữ nhiệt bốc khói nghi ngút mùi trà sen thơm ngát.</w:t>
+        <w:t>Chú Tùng run rẩy lật từng trang tài liệu dập rập Hán Nôm màu mực nho, lắc đầu với đôi mắt trũng sâu:</w:t>
       </w:r>
     </w:p>
     <w:p>
@@ -330,7 +330,7 @@
           <w:color w:val="141414"/>
           <w:sz w:val="24"/>
         </w:rPr>
-        <w:t>"Cháu cảm ơn chú Tùng." Tôi đón lấy chiếc ly, hai bàn tay áp vào thân kim loại ấm áp.</w:t>
+        <w:t>"Không có... Cổ tịch thời Nguyễn và các ghi chép địa chí phương Nam chỉ nói rằng ngã ba sông Nhà Bè là nơi 'Giao long tụ hội, sóng đỏ trào dâng, đáy sông có cổng đá trấn giữ khí mạch'. Nhưng những gì đang hiển thị trên máy móc của chúng ta trưa nay... dường như không phải là hiện tượng thủy văn tự nhiên đơn thuần."</w:t>
       </w:r>
     </w:p>
     <w:p>
@@ -345,7 +345,7 @@
           <w:color w:val="141414"/>
           <w:sz w:val="24"/>
         </w:rPr>
-        <w:t>Chú Tùng hướng ánh nhìn xa xăm về phía ngã ba sông mênh mông, nơi dòng phù sa nâu đỏ của sông Đồng Nai hòa lẫn vào sắc nước sông Sài Gòn rồi bỗng nhiên biến chuyển thành một vệt nước màu đỏ quạch như chu sa.</w:t>
+        <w:t>Đứng cạnh họ, trong bộ quân phục dã chiến của Viện Nghiên cứu Địa tầng và Năng lượng Nội sinh Đô thị, tôi không cần nhìn vào màn hình máy tính để biết chuyện gì đang xảy ra.</w:t>
       </w:r>
     </w:p>
     <w:p>
@@ -360,7 +360,7 @@
           <w:color w:val="141414"/>
           <w:sz w:val="24"/>
         </w:rPr>
-        <w:t>"Vùng nước Nhà Bè này từ xưa đã nổi tiếng hiểm trở." Chú Tùng chậm rãi nói, giọng nhuốm màu hoài niệm của một nhà nghiên cứu văn hóa dân gian: "Ca dao xưa có câu: *'Nhà Bè nước chảy chia hai, ai về Gia Định, Đồng Nai thì về'*. Các cụ ngày trước chỉ thấy nước chảy xiết tạo thành xoáy ngầm sâu hoắm nuốt chìm ghe thuyền, nên mới dựng những bè tre kết lại giữa sông làm nơi cứu tế nước ngọt và gạo cho người lỡ độ đường. Nhưng theo những mảnh tài liệu Hán Nôm dập rập từ thời chúa Nguyễn mà Viện vừa phục chế đêm qua, phía dưới tầng bùn sét bốn mươi mét nơi đáy sông này từng có một công trình kè đá quy mô phi thường. Người xưa gọi đó là cửa cống Trấn Ba."</w:t>
+        <w:t>Nhờ thành tựu Luyện Cốt Hóa Tủy tầng hai — Cốt Tủy Thông Minh — đạt được đêm qua, hai trăm linh sáu mảnh xương trên toàn thân thể tôi đang run rẩy từng hồi đau buốt. Đó không phải là nỗi đau do va đập cơ học, mà là một cảm giác buốt giá xuyên thấu tủy sống, giống như có hàng ngàn mũi kim băng giá vô hình đang chọc thẳng vào các khớp xương.</w:t>
       </w:r>
     </w:p>
     <w:p>
@@ -375,112 +375,7 @@
           <w:color w:val="141414"/>
           <w:sz w:val="24"/>
         </w:rPr>
-        <w:t>"Cửa cống Trấn Ba..." Tôi lặp lại cụm từ ấy, mắt dõi theo vệt sương mù xám bạc đang bốc lên là là trên mặt nước đỏ.</w:t>
-      </w:r>
-    </w:p>
-    <w:p>
-      <w:pPr>
-        <w:spacing w:line="300" w:lineRule="auto" w:after="120"/>
-        <w:ind w:firstLine="432"/>
-        <w:jc w:val="both"/>
-      </w:pPr>
-      <w:r>
-        <w:rPr>
-          <w:rFonts w:ascii="Times New Roman" w:hAnsi="Times New Roman"/>
-          <w:color w:val="141414"/>
-          <w:sz w:val="24"/>
-        </w:rPr>
-        <w:t>"Đúng vậy. Nhưng đó là cách người xưa nhìn nhận theo nhãn quan phong thủy thời bấy giờ." Tiến sĩ Trịnh Hoài Nam từ trong cabin điều hành bước ra, trên tay cầm chiếc máy tính bảng quân sự đang hiển thị mặt cắt địa chấn 3D đáy sông: "Còn dưới góc độ địa kỹ thuật hiện đại, chúng tôi ghi nhận một đới đứt gãy kiến tạo cổ chạy ngầm dọc theo lũng sông Soài Rạp. Vệt nước màu đỏ thẫm mà chúng ta đang thấy không phải là do phù sa thông thường, cũng không phải tảo biển độc hại. Cảm biến quang phổ vừa phân tích mẫu nước bề mặt cho thấy hàm lượng oxit sắt, thạch anh vi tinh thể và hạt khoáng chu sa tăng vọt gấp hai mươi lần mức bình thường. Có một luồng áp lực thủy tĩnh cực lớn từ dưới tầng đáy sâu đang đùn những lớp khoáng vật ngàn năm này lên mặt nước."</w:t>
-      </w:r>
-    </w:p>
-    <w:p>
-      <w:pPr>
-        <w:spacing w:line="300" w:lineRule="auto" w:after="120"/>
-        <w:ind w:firstLine="432"/>
-        <w:jc w:val="both"/>
-      </w:pPr>
-      <w:r>
-        <w:rPr>
-          <w:rFonts w:ascii="Times New Roman" w:hAnsi="Times New Roman"/>
-          <w:color w:val="141414"/>
-          <w:sz w:val="24"/>
-        </w:rPr>
-        <w:t>Đại úy Trần Văn Hùng rảo bước tới, sắc mặt nghiêm nghị trong bộ quân phục dã chiến gọn gàng:</w:t>
-      </w:r>
-    </w:p>
-    <w:p>
-      <w:pPr>
-        <w:spacing w:line="300" w:lineRule="auto" w:after="120"/>
-        <w:ind w:firstLine="432"/>
-        <w:jc w:val="both"/>
-      </w:pPr>
-      <w:r>
-        <w:rPr>
-          <w:rFonts w:ascii="Times New Roman" w:hAnsi="Times New Roman"/>
-          <w:color w:val="141414"/>
-          <w:sz w:val="24"/>
-        </w:rPr>
-        <w:t>"Báo cáo Tiến sĩ Nam, cậu An. Cảng vụ Hàng hải TP.HCM vừa phát điện văn chấp thuận lập vùng cấm luồng tạm thời trong bán kính bốn trăm mét quanh tàu `Đại Dương 09`. Hai cano cao tốc của Thủy đoàn II Cảnh sát đường thủy và Trạm Biên phòng Cửa khẩu Nhà Bè đang duy trì phao tiêu phân luồng phía ngoài, bảo đảm các tàu hàng quốc tế không đi lệch vào vùng xoáy nước. Toàn bộ thiết bị lặn sâu chuyên dụng đã sẵn sàng trên sàn cẩu."</w:t>
-      </w:r>
-    </w:p>
-    <w:p>
-      <w:pPr>
-        <w:spacing w:line="300" w:lineRule="auto" w:after="120"/>
-        <w:ind w:firstLine="432"/>
-        <w:jc w:val="both"/>
-      </w:pPr>
-      <w:r>
-        <w:rPr>
-          <w:rFonts w:ascii="Times New Roman" w:hAnsi="Times New Roman"/>
-          <w:color w:val="141414"/>
-          <w:sz w:val="24"/>
-        </w:rPr>
-        <w:t>Tôi quay nhìn về phía sàn thao tác đuôi tàu. Chiếc lồng lặn áp lực cao bằng hợp kim titan hình trụ tròn màu cam sáng đang được dàn tời thủy lực nâng lên khỏi bệ đỡ. Bên cạnh đó, hai người nhái đặc nhiệm dày dạn kinh nghiệm của hải quân đang kiểm tra lần cuối các cụm van thở Nitrox, bình dưỡng khí nén hỗn hợp helium-oxy và dây rốn tín hiệu tích hợp camera độ phân giải cao.</w:t>
-      </w:r>
-    </w:p>
-    <w:p>
-      <w:pPr>
-        <w:spacing w:line="300" w:lineRule="auto" w:after="120"/>
-        <w:ind w:firstLine="432"/>
-        <w:jc w:val="both"/>
-      </w:pPr>
-      <w:r>
-        <w:rPr>
-          <w:rFonts w:ascii="Times New Roman" w:hAnsi="Times New Roman"/>
-          <w:color w:val="141414"/>
-          <w:sz w:val="24"/>
-        </w:rPr>
-        <w:t>Tôi hít một hơi không khí mang theo vị mặn của gió biển, rồi khẽ nhắm mắt lại.</w:t>
-      </w:r>
-    </w:p>
-    <w:p>
-      <w:pPr>
-        <w:spacing w:line="300" w:lineRule="auto" w:after="120"/>
-        <w:ind w:firstLine="432"/>
-        <w:jc w:val="both"/>
-      </w:pPr>
-      <w:r>
-        <w:rPr>
-          <w:rFonts w:ascii="Times New Roman" w:hAnsi="Times New Roman"/>
-          <w:color w:val="141414"/>
-          <w:sz w:val="24"/>
-        </w:rPr>
-        <w:t>Dưới lòng bàn chân trần áp sát mặt sàn boong tàu, tầng xương tủy của tôi khẽ rung lên từng chập.</w:t>
-      </w:r>
-    </w:p>
-    <w:p>
-      <w:pPr>
-        <w:spacing w:line="300" w:lineRule="auto" w:after="120"/>
-        <w:ind w:firstLine="432"/>
-        <w:jc w:val="both"/>
-      </w:pPr>
-      <w:r>
-        <w:rPr>
-          <w:rFonts w:ascii="Times New Roman" w:hAnsi="Times New Roman"/>
-          <w:color w:val="141414"/>
-          <w:sz w:val="24"/>
-        </w:rPr>
-        <w:t>Nhờ thành tựu Luyện Cốt sơ kỳ đạt được sau những đêm trui rèn gian khổ, khung xương của tôi giờ đây có khả năng dẫn truyền cơ học cực kỳ nhạy bén. Tôi không nhìn thấy những hình ảnh kỳ ảo viễn vông nào, nhưng qua từng đợt rung lắc của vỏ thép con tàu, tôi cảm nhận được một lực cản vật lý khổng lồ đang cuộn xoáy dưới độ sâu bốn mươi mét. Đó là một dòng chảy rối có vận tốc lên tới gần ba mét mỗi giây, va đập liên hồi vào một khối kiến trúc sừng sững nằm ngập trong bùn lầy, tạo nên một dải dao động tần số thấp rền rĩ như tiếng máy phát điện ngầm khổng lồ.</w:t>
+        <w:t>Một luồng khí tức tịch diệt, tàn khốc và hoàn toàn xa lạ đang từ dưới độ sâu bốn mươi mét lòng bùn bốc lên cuồn cuộn.</w:t>
       </w:r>
     </w:p>
     <w:p>
@@ -510,7 +405,7 @@
           <w:color w:val="141414"/>
           <w:sz w:val="24"/>
         </w:rPr>
-        <w:t>Một thanh âm trong trẻo nhưng mỏng manh tựa như làn khói thoảng qua vang lên sâu trong thức hải tôi.</w:t>
+        <w:t>Trong thức hải của tôi, thanh âm của Lâm Tịch bỗng vang lên. Nhưng khác hẳn với sự điềm đạm, lạnh lùng thường ngày của một nữ kiếm tiên viễn cổ, giọng nói của nàng lúc này ngập tràn một sự kinh hoàng chưa từng thấy:</w:t>
       </w:r>
     </w:p>
     <w:p>
@@ -525,7 +420,7 @@
           <w:color w:val="141414"/>
           <w:sz w:val="24"/>
         </w:rPr>
-        <w:t>Đó là giọng của Lâm Tịch. Nhưng không giống như vẻ uy nghiêm, trang trọng lúc sáng, giọng nàng lúc này lộ rõ sự mệt mỏi cùng cực. Từng âm tiết phát ra như phải vượt qua một tầng sương mù dày đặc che khuất tâm trí.</w:t>
+        <w:t>*"Khí tức này... Không thể nào... Tại sao lại có dấu vết của bọn chúng ở một nơi phàm trần như thế này?!"*</w:t>
       </w:r>
     </w:p>
     <w:p>
@@ -540,7 +435,7 @@
           <w:color w:val="141414"/>
           <w:sz w:val="24"/>
         </w:rPr>
-        <w:t>*"Cô Tịch? Cô có sao không?"* Tôi vội vàng tập trung ý niệm hỏi lại trong đầu.</w:t>
+        <w:t>"Lâm Tịch, rốt cuộc dưới đáy sông kia là cái gì?" Tôi lập tức truyền ý niệm gặng hỏi.</w:t>
       </w:r>
     </w:p>
     <w:p>
@@ -555,7 +450,7 @@
           <w:color w:val="141414"/>
           <w:sz w:val="24"/>
         </w:rPr>
-        <w:t>Một thoáng im lặng kéo dài, rồi tiếng thở dài nhè nhẹ của nàng truyền đến:</w:t>
+        <w:t>Hư ảnh của Lâm Tịch hiện ra trong tâm thức tôi, sắc mặt nàng trắng bệch không còn một giọt máu, đôi mắt nhìn chằm chằm về hướng hạ lưu với sự cảnh giác tột độ:</w:t>
       </w:r>
     </w:p>
     <w:p>
@@ -570,7 +465,7 @@
           <w:color w:val="141414"/>
           <w:sz w:val="24"/>
         </w:rPr>
-        <w:t>*"Ta không sao... Chỉ là tàn hồn chưa lành lặn, lại liên tiếp tiêu hao nguyên thần để cộng hưởng kiếm ý, linh lực trong thức hải đã cạn kiệt phần lớn. Ký ức của ta về vùng nước này... rất mờ mịt. Ta chỉ lờ mờ nhớ rằng nơi này từng có một kết cấu phong tỏa dòng nước rất lớn, dùng để ngăn chặn sự xói mòn và giữ vững điểm tựa cho vùng châu thổ. Nhưng bản chất thực sự của nó bị chôn vùi quá sâu, chính ta lúc này cũng không thể nhìn thấu được..."*</w:t>
+        <w:t>*"Đó không phải là năng lượng long mạch... Càng không phải là sự cố đứt gãy địa tầng phàm trần! Đó là **Hư Không Tha Hóa Khí**... Dấu vết của thế lực hủy diệt từng giáng xuống cõi Cố Thổ của ta năm xưa, xé rách chín tầng trời, biến hàng ngàn tông môn vĩ đại thành bình địa tro tàn!*</w:t>
       </w:r>
     </w:p>
     <w:p>
@@ -585,7 +480,7 @@
           <w:color w:val="141414"/>
           <w:sz w:val="24"/>
         </w:rPr>
-        <w:t>Lâm Tịch dừng lại một nhịp, dường như phải cố gắng gom góp chút sức lực tàn dư để dặn dò tôi:</w:t>
+        <w:t>*Năm xưa, khi các bậc đại năng Khí Huyết Đạo liên thủ thiết lập đại trận phong ấn cõi đất này, họ đã dùng Thủy Môn để chặn đứng cửa biển phương Nam. Nhưng bây giờ... phong ấn dưới đáy sông đang rò rỉ! Lực lượng tha hóa từ vực sâu biển cả đang men theo vết nứt ngoài khơi âm thầm gặm nhấm cánh cổng ngầm!"*</w:t>
       </w:r>
     </w:p>
     <w:p>
@@ -600,7 +495,7 @@
           <w:color w:val="141414"/>
           <w:sz w:val="24"/>
         </w:rPr>
-        <w:t>*"Ngươi phải nhớ kỹ... Ngươi mới chỉ bước qua ngưỡng Luyện Cốt sơ kỳ, thể xác phàm nhân này vẫn có giới hạn sinh học rõ ràng. Xuống tới bốn mươi mét nước, áp suất tương đương năm lần khí quyển sẽ đè nặng lên từng cen-ti-mét vuông da thịt. Nếu ngươi cậy mạnh dùng sức phàm chống lại nước, lồng ngực ngươi sẽ co thắt dẫn đến vỡ mạch máu phổi trước khi kịp chạm tới đáy bùn.*</w:t>
+        <w:t>Trái tim tôi đập thắt lại.</w:t>
       </w:r>
     </w:p>
     <w:p>
@@ -615,7 +510,7 @@
           <w:color w:val="141414"/>
           <w:sz w:val="24"/>
         </w:rPr>
-        <w:t>*Khi xuống nước, hãy thu liễm mọi ý nghĩ phân tán. Vận hành luồng hơi thở Khí Huyết theo vòng Tam Chu Thiên chậm lại ba nhịp so với bình thường, để dòng máu ấm nuôi dưỡng màng tủy, để khung xương tự triệt tiêu lực ép của nước. Ngươi hiểu chưa?"*</w:t>
+        <w:t>Vết rạn phong ấn viễn cổ! Lực lượng tha hóa từ biển sâu!</w:t>
       </w:r>
     </w:p>
     <w:p>
@@ -630,7 +525,7 @@
           <w:color w:val="141414"/>
           <w:sz w:val="24"/>
         </w:rPr>
-        <w:t>*"Tôi hiểu rồi. Cảm ơn cô."* Tôi đáp thầm, trong lòng dâng lên một sự tôn trọng và ấm áp tĩnh lặng.</w:t>
+        <w:t>Những lời nói của Lâm Tịch như một quả bom sấm sét nổ tung trong tâm trí tôi, đập tan hoàn toàn những suy nghĩ ngây thơ trước đây. Hóa ra, những sự cố sụt lún ở Ba Son, rung chấn ở Thủ Thiêm hay thủy triều đỏ ở Nhà Bè không phải là những sự kiện ngẫu nhiên riêng lẻ của tự nhiên. Chúng là những dấu hiệu cảnh báo đầu tiên cho thấy chiếc lồng phong ấn bảo vệ cõi đất này suốt muôn vàn năm qua đang bước vào thời kỳ rạn nứt!</w:t>
       </w:r>
     </w:p>
     <w:p>
@@ -645,7 +540,7 @@
           <w:color w:val="141414"/>
           <w:sz w:val="24"/>
         </w:rPr>
-        <w:t>Lâm Tịch không phải là một vị thần toàn năng có thể giải quyết mọi rắc rối bằng một cái phẩy tay. Nàng là một tồn tại cổ xưa mang đầy thương tích, đang cùng tôi nương tựa vào nhau để sinh tồn. Sự nhắc nhở mộc mạc và chân thực của nàng quý giá hơn bất kỳ lời hứa hẹn thần thông rực rỡ nào.</w:t>
+        <w:t>Và nếu cánh cổng Thủy Môn này sụp đổ, thứ tràn vào thành phố mười triệu dân không chỉ là nước sông ngập lụt, mà là sự tha hóa hủy diệt của chiều không gian bên ngoài!</w:t>
       </w:r>
     </w:p>
     <w:p>
@@ -660,7 +555,7 @@
           <w:color w:val="141414"/>
           <w:sz w:val="24"/>
         </w:rPr>
-        <w:t>"Cậu An, đã đến giờ." Đại úy Hùng bước tới, đưa cho tôi bộ đồ lặn chuyên dụng bằng cao su tổng hợp neoprene gia cường sợi chống đâm thủng: "Bộ đồ này trang bị mạch sưởi nhiệt điện trở và van xả áp tự động. Chúng tôi sẽ hạ lồng lặn xuống độ sâu ba mươi lăm mét, sau đó hai đồng chí người nhái giàu kinh nghiệm nhất sẽ cùng cậu rời lồng bằng dây cáp rốn an toàn để tiếp cận vị trí dị thường."</w:t>
+        <w:t>"Báo cáo Giám đốc Minh An, buồng lặn áp lực cao titan đã được đưa vào vị trí cẩu!" Đại úy Trần Văn Hùng bước vào phòng điều hành, quân phục ướt đẫm hơi sương mặn: "Đội lặn đặc nhiệm gồm Lặn 01 đồng chí Dũng, Lặn 02 đồng chí Thành và tôi đã sẵn sàng. Nhưng theo quy chuẩn an toàn hàng hải, với độ lệch từ trường và dòng xoáy dị thường cấp độ bốn này, việc lặn xuống đáy sâu bốn mươi mét là cực kỳ nguy hiểm!"</w:t>
       </w:r>
     </w:p>
     <w:p>
@@ -675,7 +570,7 @@
           <w:color w:val="141414"/>
           <w:sz w:val="24"/>
         </w:rPr>
-        <w:t>Tôi gật đầu dứt khoát:</w:t>
+        <w:t>Tôi quay người lại, ánh mắt kiên định nhìn thẳng vào Đại úy Hùng và Tiến sĩ Nam:</w:t>
       </w:r>
     </w:p>
     <w:p>
@@ -690,7 +585,7 @@
           <w:color w:val="141414"/>
           <w:sz w:val="24"/>
         </w:rPr>
-        <w:t>"Rõ, Đại úy!"</w:t>
+        <w:t>"Đại úy Hùng, anh ở lại boong tàu chỉ huy trung tâm điều phối và giám sát thông số sống. Tôi sẽ trực tiếp xuống đáy sông cùng đồng chí Dũng và đồng chí Thành."</w:t>
       </w:r>
     </w:p>
     <w:p>
@@ -705,7 +600,7 @@
           <w:color w:val="141414"/>
           <w:sz w:val="24"/>
         </w:rPr>
-        <w:t>Mười phút sau.</w:t>
+        <w:t>"Cậu An, không thể mạo hiểm như vậy!" Tiến sĩ Nam giật mình can ngăn: "Cậu là Giám đốc Kỹ thuật Dữ liệu, là linh hồn phân tích toán học của toàn bộ Viện! Nếu xảy ra sự cố áp suất hay trượt lở đáy bùn..."</w:t>
       </w:r>
     </w:p>
     <w:p>
@@ -720,7 +615,7 @@
           <w:color w:val="141414"/>
           <w:sz w:val="24"/>
         </w:rPr>
-        <w:t>Tôi đã mặc xong toàn bộ trang bị lặn nặng gần ba mươi kilôgam. Mũ lặn composite có kính vòm quan sát rộng được khóa chặt vào cổ áo bằng khớp ren kim loại đanh gọn. Tiếng xì xào của van cấp khí Nitrox vang lên đều đặn bên tai, mang theo luồng dưỡng khí khô mát thổi thẳng vào khoang mũi.</w:t>
+        <w:t>"Chính vì tôi hiểu rõ cấu trúc dữ liệu của Thủy Môn nhất nên tôi bắt buộc phải xuống," tôi ngắt lời ông, giọng nói bình thản nhưng chứa đựng một sức nặng không thể chối từ: "Thiết bị điện tử đã bị nhiễu loạn sóng âm, camera quang học dưới làn nước đỏ này tầm nhìn không quá một mét. Chỉ có trực giác định vị cơ học và khả năng cảm ứng trường lực của tôi mới có thể xác định được then chốt của công trình ngầm. Nếu chần chừ thêm một giờ nữa khi con nước ròng rút cạn, áp lực chênh lệch sẽ xé toạc toàn bộ chân đế đáy sông!"</w:t>
       </w:r>
     </w:p>
     <w:p>
@@ -735,7 +630,7 @@
           <w:color w:val="141414"/>
           <w:sz w:val="24"/>
         </w:rPr>
-        <w:t>Trên ngực tôi, một cụm cảm biến sinh học truyền dữ liệu nhịp tim và huyết áp trực tiếp về màn hình của Tiến sĩ Nam.</w:t>
+        <w:t>Nhìn thấy ánh mắt sáng quắc, bất biến như bàn thạch của tôi, Tiến sĩ Nam lặng người đi một nhịp, rồi thở dài gật đầu:</w:t>
       </w:r>
     </w:p>
     <w:p>
@@ -750,7 +645,7 @@
           <w:color w:val="141414"/>
           <w:sz w:val="24"/>
         </w:rPr>
-        <w:t>"Kiểm tra bộ đàm: Một, hai, ba, bốn." Tiếng tôi vang lên qua micro gắn trong mũ.</w:t>
+        <w:t>"Được... Bảo trọng, Minh An! Toàn bộ nguồn lực của tàu `Đại Dương 09` sẽ hỗ trợ cậu đến cùng!"</w:t>
       </w:r>
     </w:p>
     <w:p>
@@ -765,7 +660,7 @@
           <w:color w:val="141414"/>
           <w:sz w:val="24"/>
         </w:rPr>
-        <w:t>"Nghe rất rõ, cậu An!" Giọng Tiến sĩ Nam phản hồi lập tức: "Nhịp tim bảy mươi hai, huyết áp một trăm hai mươi trên tám mươi. Chỉ số sinh tồn hoàn hảo. Hãy nhớ, an toàn sinh mạng là ưu tiên số một. Nếu cảm thấy tức ngực hoặc choáng váng vì áp lực, lập tức giật dây tín hiệu để tời kéo lồng lên ngay!"</w:t>
+        <w:t>Một giờ trưa.</w:t>
       </w:r>
     </w:p>
     <w:p>
@@ -780,7 +675,7 @@
           <w:color w:val="141414"/>
           <w:sz w:val="24"/>
         </w:rPr>
-        <w:t>"Đã hiểu."</w:t>
+        <w:t>Tôi cùng hai chiến sĩ người nhái dạn dày kinh nghiệm nhất của Đội Đặc nhiệm Hải quân bước vào khoang buồng lặn áp lực cao bằng hợp kim titan.</w:t>
       </w:r>
     </w:p>
     <w:p>
@@ -795,7 +690,7 @@
           <w:color w:val="141414"/>
           <w:sz w:val="24"/>
         </w:rPr>
-        <w:t>Tôi bước vào trong lồng lặn hình trụ cùng hai chiến sĩ đặc nhiệm hải quân mang mã hiệu Lặn 01 và Lặn 02. Cánh cửa thép nặng nề đóng sầm lại, các chốt an toàn xoay tròn khóa chặt.</w:t>
+        <w:t>Cánh cửa thép tròn dày hai mươi phân đóng sầm lại, tiếng van thủy lực khóa chặt vang lên những tiếng *cạch... cạch* đanh gọn. Chúng tôi mang trên mình bộ đồ lặn dã chiến chuyên dụng bằng cao su neoprene bọc sợi kevlar, đeo bình khí thở hỗn hợp Nitrox và đội chiếc mũ lặn áp lực cao có tích hợp đèn halogen công suất ba ngàn watt.</w:t>
       </w:r>
     </w:p>
     <w:p>
@@ -810,7 +705,7 @@
           <w:color w:val="141414"/>
           <w:sz w:val="24"/>
         </w:rPr>
-        <w:t>*Két... Két...*</w:t>
+        <w:t>*Rắc... Rắc...*</w:t>
       </w:r>
     </w:p>
     <w:p>
@@ -825,22 +720,7 @@
           <w:color w:val="141414"/>
           <w:sz w:val="24"/>
         </w:rPr>
-        <w:t>Cần cẩu thủy lực gầm lên. Chiếc lồng lặn từ từ nhấc bổng khỏi sàn tàu, vươn qua mạn sắt rồi bắt đầu hạ dần xuống mặt nước sông Soài Rạp.</w:t>
-      </w:r>
-    </w:p>
-    <w:p>
-      <w:pPr>
-        <w:spacing w:line="300" w:lineRule="auto" w:after="120"/>
-        <w:ind w:firstLine="432"/>
-        <w:jc w:val="both"/>
-      </w:pPr>
-      <w:r>
-        <w:rPr>
-          <w:rFonts w:ascii="Times New Roman" w:hAnsi="Times New Roman"/>
-          <w:color w:val="141414"/>
-          <w:sz w:val="24"/>
-        </w:rPr>
-        <w:t>Một giây trước khi mặt nước đỏ thẫm nuốt chửng tầm nhìn qua ô kính, tôi kịp nhìn thấy bầu trời phương Nam trong xanh lồng lộng phía trên đầu, thấy những nhành bần xanh rì ven bờ Nhà Bè, và bóng hình chú Tùng cùng Đại úy Hùng đang đứng nghiêm nghị dõi theo.</w:t>
+        <w:t>Cần cẩu thủy lực trên boong tàu từ từ nhấc bổng khối lồng lặn nặng bốn tấn rời khỏi sàn tàu, thả dần xuống mặt nước đỏ ngầu của ngã ba sông Nhà Bè.</w:t>
       </w:r>
     </w:p>
     <w:p>
@@ -870,7 +750,7 @@
           <w:color w:val="141414"/>
           <w:sz w:val="24"/>
         </w:rPr>
-        <w:t>Một tiếng va đập lớn vang lên khi đáy lồng chạm nước.</w:t>
+        <w:t>Bọt nước đỏ ngầu bắn tung tóe. Toàn bộ thế giới bên ngoài cửa kính quan sát lập tức chuyển sang một màu đỏ sẫm như máu loãng.</w:t>
       </w:r>
     </w:p>
     <w:p>
@@ -885,7 +765,7 @@
           <w:color w:val="141414"/>
           <w:sz w:val="24"/>
         </w:rPr>
-        <w:t>Mặt sông khép lại trên nóc lồng lặn. Toàn bộ âm thanh ồn ã của còi tàu, tiếng máy nổ và gió biển lập tức biến mất, nhường chỗ cho một sự im lặng đặc quánh, thăm thẳm và đầy áp bức.</w:t>
+        <w:t>Mười mét... Hai mươi mét... Ba mươi mét...</w:t>
       </w:r>
     </w:p>
     <w:p>
@@ -900,7 +780,7 @@
           <w:color w:val="141414"/>
           <w:sz w:val="24"/>
         </w:rPr>
-        <w:t>Nước sông Nhà Bè đục ngầu phù sa đỏ quạch. Dù dàn đèn pha halogen công suất cao gắn quanh lồng lặn đã bật sáng hết cỡ, tầm nhìn qua ô kính lặn vẫn bị thu hẹp chỉ còn chưa đầy một mét rưỡi. Những hạt bụi khoáng thạch màu đồng thau lấp lánh trôi lơ lửng trong làn nước, va chạm vào thành kính tạo nên những vệt sáng nhờ nhợ như đom đóm trong đêm tối.</w:t>
+        <w:t>Chiếc lồng lặn hạ sâu dần vào lòng sông Soài Rạp. Áp suất thủy tĩnh bên ngoài tăng vọt theo từng mét độ sâu, đè nặng lên lớp vỏ hợp kim titan khiến thân lồng phát ra những tiếng cọt kẹt âm u rợn người.</w:t>
       </w:r>
     </w:p>
     <w:p>
@@ -915,7 +795,7 @@
           <w:color w:val="141414"/>
           <w:sz w:val="24"/>
         </w:rPr>
-        <w:t>*Mười mét...*</w:t>
+        <w:t>Khi đồng hồ đo độ sâu điểm con số ba mươi tám mét, chiếc lồng lặn chạm nhẹ vào lớp bùn nhão đáy sông.</w:t>
       </w:r>
     </w:p>
     <w:p>
@@ -930,7 +810,7 @@
           <w:color w:val="141414"/>
           <w:sz w:val="24"/>
         </w:rPr>
-        <w:t>Đồng hồ đo độ sâu trên cổ tay tôi nhảy số. Tai tôi bắt đầu có cảm giác lùng bùng nghẹt lại vì chênh lệch áp suất. Tôi khẽ nuốt nước bọt, thực hiện thao tác cân bằng áp lực hòm nhĩ.</w:t>
+        <w:t>"Lặn 01, Lặn 02, chuẩn bị xuất khoang!" Giọng tôi vang lên qua micro mũ lặn.</w:t>
       </w:r>
     </w:p>
     <w:p>
@@ -945,7 +825,7 @@
           <w:color w:val="141414"/>
           <w:sz w:val="24"/>
         </w:rPr>
-        <w:t>*Hai mươi mét...*</w:t>
+        <w:t>"Rõ!" Hai người lính đặc nhiệm hải quân dứt khoát kiểm tra lại dây cáp rốn bọc thép định vị và mở chốt cửa thoát hiểm đáy lồng.</w:t>
       </w:r>
     </w:p>
     <w:p>
@@ -960,7 +840,7 @@
           <w:color w:val="141414"/>
           <w:sz w:val="24"/>
         </w:rPr>
-        <w:t>Dòng nước bên ngoài bắt đầu chảy xiết dữ dội. Chiếc lồng lặn bằng titan nặng hơn một tấn khẽ chao đảo, dây cáp chịu lực căng ra phát ra những tiếng *ken két* khô khốc. Nhiệt độ nước tụt nhanh từ ba mươi độ C xuống còn chưa đầy mười tám độ C. Cảm giác lạnh buốt bắt đầu thấm qua lớp cao su bảo hộ, bóp nghẹt lấy các đầu ngón chân.</w:t>
+        <w:t>Dòng nước lạnh buốt ập vào khoang ngập tới ngực. Chúng tôi bước chân ra khỏi lồng lặn, dẫm chân lên tầng trầm tích đáy sâu ngã ba sông Nhà Bè.</w:t>
       </w:r>
     </w:p>
     <w:p>
@@ -975,7 +855,7 @@
           <w:color w:val="141414"/>
           <w:sz w:val="24"/>
         </w:rPr>
-        <w:t>*Ba mươi mét... Ba mươi lăm mét...*</w:t>
+        <w:t>Dưới độ sâu gần bốn mươi mét, áp suất nước lên tới gần năm atmosphere ép chặt vào lồng ngực tôi. Nếu không có khung xương tủy Luyện Cốt sơ kỳ vững chắc nâng đỡ các cơ quan nội tạng và nhịp thở Tam Chu Thiên liên tục điều hòa áp lực máu, một người bình thường dù có mặc đồ lặn chuyên dụng cũng sẽ bị tức ngực, màng nhĩ đau buốt đến ngất lịm.</w:t>
       </w:r>
     </w:p>
     <w:p>
@@ -990,7 +870,7 @@
           <w:color w:val="141414"/>
           <w:sz w:val="24"/>
         </w:rPr>
-        <w:t>"Áp lực ngoài khoang: bốn phẩy năm bar!" Tiếng kỹ sư Tuấn vang lên qua tai nghe, lẫn trong tiếng rè rè của sóng vô tuyến xuyên nước: "Lồng lặn đã tiếp cận độ sâu ba mươi lăm mét! Cách đáy bùn năm mét! Dòng xoáy ngầm đo được hai phẩy bốn mét trên giây! Độ đục vượt ngưỡng quan sát quang học!"</w:t>
+        <w:t>Tôi đưa tay bật ngọn đèn chiếu điểm cực mạnh gắn trên vai.</w:t>
       </w:r>
     </w:p>
     <w:p>
@@ -1005,7 +885,7 @@
           <w:color w:val="141414"/>
           <w:sz w:val="24"/>
         </w:rPr>
-        <w:t>"Lặn 01 báo cáo: Mở cửa lồng lặn!" Tiếng người chiến sĩ đặc nhiệm đi cùng tôi vang lên bình tĩnh qua bộ đàm.</w:t>
+        <w:t>Luồng ánh sáng vàng đậm xé toạc màn nước đỏ quạch phù sa, rọi thẳng về phía trước.</w:t>
       </w:r>
     </w:p>
     <w:p>
@@ -1020,7 +900,7 @@
           <w:color w:val="141414"/>
           <w:sz w:val="24"/>
         </w:rPr>
-        <w:t>Cửa lồng bật mở.</w:t>
+        <w:t>Và ngay khoảnh khắc luồng sáng chạm tới đáy sâu, cả ba chúng tôi đều chết lặng vì kinh ngạc:</w:t>
       </w:r>
     </w:p>
     <w:p>
@@ -1035,7 +915,7 @@
           <w:color w:val="141414"/>
           <w:sz w:val="24"/>
         </w:rPr>
-        <w:t>Dòng nước đỏ ngầu cuộn xoáy lập tức ùa vào khoang ngập. Tôi bước chân ra khỏi lồng lặn, hai tay nắm chặt lấy dây cáp rốn định vị.</w:t>
+        <w:t>Cách vị trí lồng lặn chưa đầy mười mét, một vòm cổng đá khổng lồ sừng sững trồi lên khỏi lớp phù sa đáy sông!</w:t>
       </w:r>
     </w:p>
     <w:p>
@@ -1050,7 +930,7 @@
           <w:color w:val="141414"/>
           <w:sz w:val="24"/>
         </w:rPr>
-        <w:t>Một sức nặng kinh hoàng lập tức đè sụp lên toàn bộ cơ thể tôi!</w:t>
+        <w:t>Đó là một công trình kỳ vĩ được ghép từ hàng ngàn phiến đá thanh hoa màu xám đen, mỗi phiến đá nặng hàng chục tấn, được đẽo gọt vuông vức và khớp nối khít khao đến mức không thể nhét lọt một mũi dao. Vòm cổng cao hơn sáu mét, rộng gần mười mét, uốn lượn thành hình hai móng rồng khổng lồ cắm sâu vào lòng đất mẹ phương Nam. Trên bề mặt phiến đá, những đường vân phù điêu cổ xưa khắc họa hình tượng sông núi, sóng thần và những ký tự đạo văn viễn cổ chìm nổi dưới lớp trầm tích ngàn năm.</w:t>
       </w:r>
     </w:p>
     <w:p>
@@ -1065,7 +945,7 @@
           <w:color w:val="141414"/>
           <w:sz w:val="24"/>
         </w:rPr>
-        <w:t>Đó không phải là ảo giác, mà là sức nặng thuần túy của ba mươi lăm mét cột nước — tương đương gần năm kilôgam áp lực đè lên mỗi cen-ti-mét vuông trên lồng ngực. Không khí trong bình nén dường như trở nên đặc quánh hơn, mỗi lần hít vào đòi hỏi cơ hoành phải vận lực gấp ba lần bình thường. Cơn buốt nhức chạy dọc từ màng nhĩ xuống hai bên thái dương.</w:t>
+        <w:t>Đó chính là **Thủy Môn Cổ Phách** — chiếc then cài trấn thủy tối thượng của vùng châu thổ!</w:t>
       </w:r>
     </w:p>
     <w:p>
@@ -1080,7 +960,7 @@
           <w:color w:val="141414"/>
           <w:sz w:val="24"/>
         </w:rPr>
-        <w:t>Nhớ lời dặn của Lâm Tịch, tôi lập tức nhắm nghiền hai mắt lại, không cố dùng sức cơ bắp để gồng mình chống cự.</w:t>
+        <w:t>Thế nhưng, điều khiến toàn thân tôi lạnh toát không phải là sự đồ sộ của công trình ngầm, mà nằm ở cảnh tượng hãi hùng đang diễn ra ngay trên đỉnh vòm cổng đá:</w:t>
       </w:r>
     </w:p>
     <w:p>
@@ -1095,7 +975,7 @@
           <w:color w:val="141414"/>
           <w:sz w:val="24"/>
         </w:rPr>
-        <w:t>Tôi chậm rãi dẫn dắt luồng nhiệt lưu Khí Huyết từ đan điền cuộn lên, luồn qua đốt sống Đại Chùy rồi tỏa đều vào hai trăm linh sáu mảnh xương tủy theo vòng Tam Chu Thiên. Nhịp thở của tôi hạ chậm lại ba nhịp. Từng thớ cơ bắp dần thả lỏng, để khung xương cứng cáp như kim thạch tự động gánh vác lấy sức ép của ngoại giới.</w:t>
+        <w:t>Ngay giữa tâm vòm móng rồng, một khối cự thạch hình cầu có đường kính gần một mét — viên **Huyết Ngọc Trấn Ba** — đang lập lòe phát ra từng đợt ánh sáng đỏ rực tựa như máu tươi. Ánh sáng ấy không hề ấm áp, mà giật giãy từng hồi hỗn loạn như một trái tim đang đập những nhịp đập cuối cùng trong cơn hấp hối.</w:t>
       </w:r>
     </w:p>
     <w:p>
@@ -1110,7 +990,7 @@
           <w:color w:val="141414"/>
           <w:sz w:val="24"/>
         </w:rPr>
-        <w:t>Cơn tức ngực dần dịu đi, nhịp tim từ một trăm mười nhịp chậm rãi hạ xuống mức bảy mươi nhịp ổn định.</w:t>
+        <w:t>Và bao bọc quanh viên Huyết Ngọc cùng toàn bộ chân đế vòm đá...</w:t>
       </w:r>
     </w:p>
     <w:p>
@@ -1125,7 +1005,7 @@
           <w:color w:val="141414"/>
           <w:sz w:val="24"/>
         </w:rPr>
-        <w:t>Tôi mở mắt ra, bật chiếc đèn chiếu điểm công suất lớn cầm tay, bước theo hai người thợ lặn tiến sát xuống đáy bùn sâu ba mươi tám mét.</w:t>
+        <w:t>Là hàng vạn **sợi tơ đen kịt u ám**!</w:t>
       </w:r>
     </w:p>
     <w:p>
@@ -1140,7 +1020,7 @@
           <w:color w:val="141414"/>
           <w:sz w:val="24"/>
         </w:rPr>
-        <w:t>Dưới luồng sáng vàng xuyên thấu làn phù sa đỏ đục ngầu, đáy sông Nhà Bè dần dần hiện ra trước mắt tôi.</w:t>
+        <w:t>Chúng mảnh như sợi tóc nhưng đặc quánh như hắc ín, không ngừng ngoe nguẩy, bò trườn như những xúc tu vô hình bò ra từ một khe nứt không gian đen ngòm nằm sâu dưới chân móng Thủy Môn. Mỗi nơi mà sợi tơ đen ấy bò qua, lớp đá thanh hoa ngàn năm tuổi liền phát ra những tiếng xèo xèo rợn tóc gáy, bề mặt đá bị gặm nhấm mục ruỗng, hóa thành những mảng cát đen rỉ sét trôi lơ lửng trong làn nước!</w:t>
       </w:r>
     </w:p>
     <w:p>
@@ -1155,7 +1035,7 @@
           <w:color w:val="141414"/>
           <w:sz w:val="24"/>
         </w:rPr>
-        <w:t>Đó không phải là một bãi bùn bằng phẳng.</w:t>
+        <w:t>Cái lạnh tịch diệt mà tôi cảm nhận được từ trên boong tàu chính là phát ra từ những sợi tơ đen này!</w:t>
       </w:r>
     </w:p>
     <w:p>
@@ -1170,7 +1050,7 @@
           <w:color w:val="141414"/>
           <w:sz w:val="24"/>
         </w:rPr>
-        <w:t>Ngay trước mũi chân tôi chừng ba mét, một vách đá khổng lồ màu xám đen sừng sững vươn lên từ lớp phù sa cổ. Khối kiến trúc ấy được ghép từ những phiến đá thanh hoa nguyên khối dài hàng chục mét, phủ kín những lớp hà biển hóa thạch và gỉ đồng xanh thẫm dày cộp.</w:t>
+        <w:t>*"Đúng là nó... Hư Không Tha Hóa!"* Tiếng Lâm Tịch thét lên trong tâm thức tôi, run rẩy và đau đớn tột cùng: *"Khe nứt phong ấn đáy biển ngoài khơi đã vỡ một góc! Luồng hắc khí tha hóa này đang muốn hủy diệt viên Huyết Ngọc Trấn Ba để xé toạc hoàn toàn lối vào đất liền! Viên ngọc đang dốc cạn năng lượng bản nguyên để chống cự, tạo ra dòng nước đỏ chu sa nhằm xua đuổi tà khí... Nhưng nó sắp không chống đỡ nổi nữa rồi!"*</w:t>
       </w:r>
     </w:p>
     <w:p>
@@ -1185,7 +1065,7 @@
           <w:color w:val="141414"/>
           <w:sz w:val="24"/>
         </w:rPr>
-        <w:t>Trên bề mặt phiến đá cổ ngập trong bùn lầy, một hoa văn móng rồng uốn lượn được đục đẽo tinh xảo hiện ra dưới ánh đèn rọi rực rỡ. Và ngay chính giữa vòm cửa ngầm ấy, một dòng nước xoáy đỏ rực đang bị hút mạnh vào một khe hở kẹt đầy thân cây gỗ mục và bùn khoáng ngàn năm.</w:t>
+        <w:t>"Báo cáo tàu điều hành... Chúng tôi nhìn thấy... nhìn thấy..." Giọng người lính đặc nhiệm mang mã hiệu Lặn 01 bên cạnh tôi bỗng lắp bắp qua bộ đàm vô tuyến, hơi thở của anh dồn dập bất thường: "Có... có cái gì đó màu đen... đang chuyển động quanh khối đá..."</w:t>
       </w:r>
     </w:p>
     <w:p>
@@ -1200,7 +1080,262 @@
           <w:color w:val="141414"/>
           <w:sz w:val="24"/>
         </w:rPr>
-        <w:t>Tại độ sâu gần bốn mươi mét dưới đáy dòng sông Sài Gòn, nơi ranh giới của áp suất và bóng tối tuyệt đối, cánh cửa Thủy Môn cổ xưa đã chính thức lộ diện trước mắt những con người của năm 2026.</w:t>
+        <w:t>"Lặn 01! Bình tĩnh! Lùi lại ngay!" Tôi quát lớn qua micro, đưa tay giật mạnh dây cáp hãm của anh.</w:t>
+      </w:r>
+    </w:p>
+    <w:p>
+      <w:pPr>
+        <w:spacing w:line="300" w:lineRule="auto" w:after="120"/>
+        <w:ind w:firstLine="432"/>
+        <w:jc w:val="both"/>
+      </w:pPr>
+      <w:r>
+        <w:rPr>
+          <w:rFonts w:ascii="Times New Roman" w:hAnsi="Times New Roman"/>
+          <w:color w:val="141414"/>
+          <w:sz w:val="24"/>
+        </w:rPr>
+        <w:t>Nhưng đã quá muộn.</w:t>
+      </w:r>
+    </w:p>
+    <w:p>
+      <w:pPr>
+        <w:spacing w:line="300" w:lineRule="auto" w:after="120"/>
+        <w:ind w:firstLine="432"/>
+        <w:jc w:val="both"/>
+      </w:pPr>
+      <w:r>
+        <w:rPr>
+          <w:rFonts w:ascii="Times New Roman" w:hAnsi="Times New Roman"/>
+          <w:color w:val="141414"/>
+          <w:sz w:val="24"/>
+        </w:rPr>
+        <w:t>Sự xuất hiện của luồng ánh sáng đèn halogen cực mạnh và sóng vô tuyến từ bộ đàm của chúng tôi dường như đã đánh động đến thực thể u ám dưới đáy sâu!</w:t>
+      </w:r>
+    </w:p>
+    <w:p>
+      <w:pPr>
+        <w:spacing w:line="300" w:lineRule="auto" w:after="120"/>
+        <w:ind w:firstLine="432"/>
+        <w:jc w:val="both"/>
+      </w:pPr>
+      <w:r>
+        <w:rPr>
+          <w:rFonts w:ascii="Times New Roman" w:hAnsi="Times New Roman"/>
+          <w:color w:val="141414"/>
+          <w:sz w:val="24"/>
+        </w:rPr>
+        <w:t>*Xì xì xì...*</w:t>
+      </w:r>
+    </w:p>
+    <w:p>
+      <w:pPr>
+        <w:spacing w:line="300" w:lineRule="auto" w:after="120"/>
+        <w:ind w:firstLine="432"/>
+        <w:jc w:val="both"/>
+      </w:pPr>
+      <w:r>
+        <w:rPr>
+          <w:rFonts w:ascii="Times New Roman" w:hAnsi="Times New Roman"/>
+          <w:color w:val="141414"/>
+          <w:sz w:val="24"/>
+        </w:rPr>
+        <w:t>Đám tơ đen quấn quanh viên Huyết Ngọc bỗng nhiên co giật dữ dội.</w:t>
+      </w:r>
+    </w:p>
+    <w:p>
+      <w:pPr>
+        <w:spacing w:line="300" w:lineRule="auto" w:after="120"/>
+        <w:ind w:firstLine="432"/>
+        <w:jc w:val="both"/>
+      </w:pPr>
+      <w:r>
+        <w:rPr>
+          <w:rFonts w:ascii="Times New Roman" w:hAnsi="Times New Roman"/>
+          <w:color w:val="141414"/>
+          <w:sz w:val="24"/>
+        </w:rPr>
+        <w:t>Từ khe nứt đen ngòm dưới chân móng Thủy Môn, một luồng hắc khí cuồn cuộn trào ra như mực đen đổ vào nước, lập tức hòa vào dòng nước ngầm bốn mươi mét tạo thành một cơn lốc xoáy màu đen kịt hung hãn!</w:t>
+      </w:r>
+    </w:p>
+    <w:p>
+      <w:pPr>
+        <w:spacing w:line="300" w:lineRule="auto" w:after="120"/>
+        <w:ind w:firstLine="432"/>
+        <w:jc w:val="both"/>
+      </w:pPr>
+      <w:r>
+        <w:rPr>
+          <w:rFonts w:ascii="Times New Roman" w:hAnsi="Times New Roman"/>
+          <w:color w:val="141414"/>
+          <w:sz w:val="24"/>
+        </w:rPr>
+        <w:t>Dòng xoáy nước đen rít lên từng hồi gầm rú đinh tai nhức óc, cuốn phăng lớp bùn cát đáy sông, biến ngã ba sông Nhà Bè thành một địa ngục tối tăm không lối thoát!</w:t>
+      </w:r>
+    </w:p>
+    <w:p>
+      <w:pPr>
+        <w:spacing w:line="300" w:lineRule="auto" w:after="120"/>
+        <w:ind w:firstLine="432"/>
+        <w:jc w:val="both"/>
+      </w:pPr>
+      <w:r>
+        <w:rPr>
+          <w:rFonts w:ascii="Times New Roman" w:hAnsi="Times New Roman"/>
+          <w:color w:val="141414"/>
+          <w:sz w:val="24"/>
+        </w:rPr>
+        <w:t>*Keng!*</w:t>
+      </w:r>
+    </w:p>
+    <w:p>
+      <w:pPr>
+        <w:spacing w:line="300" w:lineRule="auto" w:after="120"/>
+        <w:ind w:firstLine="432"/>
+        <w:jc w:val="both"/>
+      </w:pPr>
+      <w:r>
+        <w:rPr>
+          <w:rFonts w:ascii="Times New Roman" w:hAnsi="Times New Roman"/>
+          <w:color w:val="141414"/>
+          <w:sz w:val="24"/>
+        </w:rPr>
+        <w:t>Một sợi tơ đen bay vụt qua làn nước, quẹt trúng cánh tay phải bọc giáp titan của Lặn 01.</w:t>
+      </w:r>
+    </w:p>
+    <w:p>
+      <w:pPr>
+        <w:spacing w:line="300" w:lineRule="auto" w:after="120"/>
+        <w:ind w:firstLine="432"/>
+        <w:jc w:val="both"/>
+      </w:pPr>
+      <w:r>
+        <w:rPr>
+          <w:rFonts w:ascii="Times New Roman" w:hAnsi="Times New Roman"/>
+          <w:color w:val="141414"/>
+          <w:sz w:val="24"/>
+        </w:rPr>
+        <w:t>Trong tích tắc, trước mắt tôi, lớp hợp kim titan chống ăn mòn biển sâu dày ba mi-li-mét bỗng nhiên xám xịt lại, nứt toác rồi rỉ sét mục nát như một mảnh sắt vụn ngâm trong axit đậm đặc hàng chục năm!</w:t>
+      </w:r>
+    </w:p>
+    <w:p>
+      <w:pPr>
+        <w:spacing w:line="300" w:lineRule="auto" w:after="120"/>
+        <w:ind w:firstLine="432"/>
+        <w:jc w:val="both"/>
+      </w:pPr>
+      <w:r>
+        <w:rPr>
+          <w:rFonts w:ascii="Times New Roman" w:hAnsi="Times New Roman"/>
+          <w:color w:val="141414"/>
+          <w:sz w:val="24"/>
+        </w:rPr>
+        <w:t>"Aaa!" Tiếng thét đau đớn của Lặn 01 vang lên qua tai nghe khi khí lạnh tha hóa ngấm qua lớp vải lót, đâm thẳng vào da thịt. Cảm biến sinh học trên mũ lặn của anh lập tức nhấp nháy đèn đỏ báo động: Nhịp tim tụt dốc không phanh từ tám mươi xuống còn bốn mươi nhịp trên phút!</w:t>
+      </w:r>
+    </w:p>
+    <w:p>
+      <w:pPr>
+        <w:spacing w:line="300" w:lineRule="auto" w:after="120"/>
+        <w:ind w:firstLine="432"/>
+        <w:jc w:val="both"/>
+      </w:pPr>
+      <w:r>
+        <w:rPr>
+          <w:rFonts w:ascii="Times New Roman" w:hAnsi="Times New Roman"/>
+          <w:color w:val="141414"/>
+          <w:sz w:val="24"/>
+        </w:rPr>
+        <w:t>"Đồng chí Thành! Đưa Dũng lùi về lồng lặn ngay lập tức! Bật van sưởi khẩn cấp!" Tôi gào lên qua bộ đàm, một tay đẩy mạnh người lính đặc nhiệm về phía cửa lồng titan.</w:t>
+      </w:r>
+    </w:p>
+    <w:p>
+      <w:pPr>
+        <w:spacing w:line="300" w:lineRule="auto" w:after="120"/>
+        <w:ind w:firstLine="432"/>
+        <w:jc w:val="both"/>
+      </w:pPr>
+      <w:r>
+        <w:rPr>
+          <w:rFonts w:ascii="Times New Roman" w:hAnsi="Times New Roman"/>
+          <w:color w:val="141414"/>
+          <w:sz w:val="24"/>
+        </w:rPr>
+        <w:t>"Còn cậu An thì sao?!" Lặn 02 hoảng hốt kêu lên giữa dòng nước xoáy đen ngòm đang cuộn trào dữ dội.</w:t>
+      </w:r>
+    </w:p>
+    <w:p>
+      <w:pPr>
+        <w:spacing w:line="300" w:lineRule="auto" w:after="120"/>
+        <w:ind w:firstLine="432"/>
+        <w:jc w:val="both"/>
+      </w:pPr>
+      <w:r>
+        <w:rPr>
+          <w:rFonts w:ascii="Times New Roman" w:hAnsi="Times New Roman"/>
+          <w:color w:val="141414"/>
+          <w:sz w:val="24"/>
+        </w:rPr>
+        <w:t>"Tôi bọc hậu! Đóng cửa lồng lại ngay!"</w:t>
+      </w:r>
+    </w:p>
+    <w:p>
+      <w:pPr>
+        <w:spacing w:line="300" w:lineRule="auto" w:after="120"/>
+        <w:ind w:firstLine="432"/>
+        <w:jc w:val="both"/>
+      </w:pPr>
+      <w:r>
+        <w:rPr>
+          <w:rFonts w:ascii="Times New Roman" w:hAnsi="Times New Roman"/>
+          <w:color w:val="141414"/>
+          <w:sz w:val="24"/>
+        </w:rPr>
+        <w:t>Tôi gạt phăng mọi sự chần chừ, bước một bước dài chắn ngang trước cửa lồng lặn.</w:t>
+      </w:r>
+    </w:p>
+    <w:p>
+      <w:pPr>
+        <w:spacing w:line="300" w:lineRule="auto" w:after="120"/>
+        <w:ind w:firstLine="432"/>
+        <w:jc w:val="both"/>
+      </w:pPr>
+      <w:r>
+        <w:rPr>
+          <w:rFonts w:ascii="Times New Roman" w:hAnsi="Times New Roman"/>
+          <w:color w:val="141414"/>
+          <w:sz w:val="24"/>
+        </w:rPr>
+        <w:t>Xung quanh tôi, dòng xoáy hắc khí đen ngòm đang bốc lên ngùn ngụt, bao vây lấy vòm cổng Thủy Môn và ép chặt lấy toàn bộ không gian đáy sông sâu bốn mươi mét. Viên Huyết Ngọc Trấn Ba trên đỉnh vòm phát ra những tia sáng đỏ rực cuối cùng trong tuyệt vọng, tiếng rạn nứt của đá khối cổ xưa vang lên răng rắc giữa màn nước đen kịt!</w:t>
+      </w:r>
+    </w:p>
+    <w:p>
+      <w:pPr>
+        <w:spacing w:line="300" w:lineRule="auto" w:after="120"/>
+        <w:ind w:firstLine="432"/>
+        <w:jc w:val="both"/>
+      </w:pPr>
+      <w:r>
+        <w:rPr>
+          <w:rFonts w:ascii="Times New Roman" w:hAnsi="Times New Roman"/>
+          <w:color w:val="141414"/>
+          <w:sz w:val="24"/>
+        </w:rPr>
+        <w:t>Đứng trước sự xâm thực tàn bạo của lực lượng tha hóa từ cõi vực sâu ngoài hành tinh, lần đầu tiên trong đời, tôi cảm nhận sâu sắc sự nhỏ bé, mong manh và bất lực của một phàm nhân bằng xương bằng thịt.</w:t>
+      </w:r>
+    </w:p>
+    <w:p>
+      <w:pPr>
+        <w:spacing w:line="300" w:lineRule="auto" w:after="120"/>
+        <w:ind w:firstLine="432"/>
+        <w:jc w:val="both"/>
+      </w:pPr>
+      <w:r>
+        <w:rPr>
+          <w:rFonts w:ascii="Times New Roman" w:hAnsi="Times New Roman"/>
+          <w:color w:val="141414"/>
+          <w:sz w:val="24"/>
+        </w:rPr>
+        <w:t>Nhưng sâu trong lồng ngực tôi, dòng máu Tam Chu Thiên bỗng nhiên sôi trào cuộn sóng, và hai trăm linh sáu mảnh xương tủy kiên định của tôi cất lên một tiếng ngân vang đầy kiêu hãnh giữa bóng tối ngàn trùng!</w:t>
       </w:r>
     </w:p>
     <w:sectPr>

</xml_diff>